<commit_message>
docs: add new business rule for login/register
</commit_message>
<xml_diff>
--- a/docs/SportManagement_BusinessRules.docx
+++ b/docs/SportManagement_BusinessRules.docx
@@ -303,7 +303,7 @@
         <w:jc w:val="center"/>
       </w:pPr>
       <w:r>
-        <w:t>Phiên bản 1.6 — Cập nhật ngày 23/09/2026</w:t>
+        <w:t>Phiên bản 1.7 — Cập nhật ngày 23/09/2026</w:t>
       </w:r>
     </w:p>
     <w:p>
@@ -2431,6 +2431,51 @@
           <w:p>
             <w:r>
               <w:t>1.6</w:t>
+            </w:r>
+          </w:p>
+        </w:tc>
+      </w:tr>
+      <w:tr>
+        <w:trPr>
+          <w:cantSplit/>
+        </w:trPr>
+        <w:tc>
+          <w:tcPr>
+            <w:tcW w:type="dxa" w:w="2600"/>
+          </w:tcPr>
+          <w:p>
+            <w:r>
+              <w:t>Hồ Lê Thiên An (qua Claude)</w:t>
+            </w:r>
+          </w:p>
+        </w:tc>
+        <w:tc>
+          <w:tcPr>
+            <w:tcW w:type="dxa" w:w="1200"/>
+          </w:tcPr>
+          <w:p>
+            <w:r>
+              <w:t>23/09/2026</w:t>
+            </w:r>
+          </w:p>
+        </w:tc>
+        <w:tc>
+          <w:tcPr>
+            <w:tcW w:type="dxa" w:w="5800"/>
+          </w:tcPr>
+          <w:p>
+            <w:r>
+              <w:t>Thêm BR-78 (Mục A): đăng ký tài khoản bằng email/mật khẩu bắt buộc xác thực quyền sở hữu email qua mã OTP trước khi tạo tài khoản; không áp dụng cho Đăng nhập Google (đã được Google xác thực). Chưa xác nhận triển khai code — xem docs/00-Source-of-Truth.md §5.8.</w:t>
+            </w:r>
+          </w:p>
+        </w:tc>
+        <w:tc>
+          <w:tcPr>
+            <w:tcW w:type="dxa" w:w="1600"/>
+          </w:tcPr>
+          <w:p>
+            <w:r>
+              <w:t>1.7</w:t>
             </w:r>
           </w:p>
         </w:tc>
@@ -13406,6 +13451,272 @@
               </w:rPr>
               <w:t>)</w:t>
             </w:r>
+          </w:p>
+        </w:tc>
+      </w:tr>
+      <w:tr>
+        <w:tblPrEx>
+          <w:tblCellMar>
+            <w:top w:w="0" w:type="dxa"/>
+            <w:bottom w:w="0" w:type="dxa"/>
+          </w:tblCellMar>
+        </w:tblPrEx>
+        <w:trPr>
+          <w:cantSplit/>
+        </w:trPr>
+        <w:tc>
+          <w:tcPr>
+            <w:tcW w:w="900" w:type="dxa"/>
+            <w:tcMar>
+              <w:top w:w="60" w:type="dxa"/>
+              <w:left w:w="100" w:type="dxa"/>
+              <w:bottom w:w="60" w:type="dxa"/>
+              <w:right w:w="100" w:type="dxa"/>
+            </w:tcMar>
+            <w:vAlign w:val="center"/>
+          </w:tcPr>
+          <w:p>
+            <w:r>
+              <w:rPr>
+                <w:b/>
+                <w:bCs/>
+                <w:sz w:val="18"/>
+                <w:szCs w:val="18"/>
+              </w:rPr>
+              <w:t>BR-78</w:t>
+            </w:r>
+          </w:p>
+        </w:tc>
+        <w:tc>
+          <w:tcPr>
+            <w:tcW w:w="5200" w:type="dxa"/>
+            <w:tcMar>
+              <w:top w:w="60" w:type="dxa"/>
+              <w:left w:w="100" w:type="dxa"/>
+              <w:bottom w:w="60" w:type="dxa"/>
+              <w:right w:w="100" w:type="dxa"/>
+            </w:tcMar>
+            <w:vAlign w:val="center"/>
+          </w:tcPr>
+          <w:p>
+            <w:proofErr w:type="spellStart"/>
+            <w:r>
+              <w:rPr>
+                <w:sz w:val="18"/>
+                <w:szCs w:val="18"/>
+              </w:rPr>
+              <w:t>Đăng ký tài khoản Hội viên bằng email/mật khẩu (không áp dụng cho tài khoản tạo qua Đăng nhập Google) bắt buộc xác thực quyền sở hữu địa chỉ email trước khi tài khoản được tạo: hệ thống gửi một mã OTP gồm 6 chữ số tới chính địa chỉ email đăng ký, mã có hiệu lực 10 phút và tối đa 5 lần thử sai; tài khoản chỉ được khởi tạo sau khi mã OTP được xác thực đúng còn hiệu lực.</w:t>
+            </w:r>
+            <w:proofErr w:type="spellEnd"/>
+            <w:proofErr w:type="spellStart"/>
+            <w:proofErr w:type="spellEnd"/>
+            <w:proofErr w:type="spellStart"/>
+            <w:proofErr w:type="spellEnd"/>
+            <w:proofErr w:type="spellStart"/>
+            <w:proofErr w:type="spellEnd"/>
+            <w:proofErr w:type="spellStart"/>
+            <w:proofErr w:type="spellEnd"/>
+            <w:proofErr w:type="spellStart"/>
+            <w:proofErr w:type="spellEnd"/>
+            <w:proofErr w:type="spellStart"/>
+            <w:proofErr w:type="spellEnd"/>
+            <w:proofErr w:type="spellStart"/>
+            <w:proofErr w:type="spellEnd"/>
+            <w:proofErr w:type="spellStart"/>
+            <w:proofErr w:type="spellEnd"/>
+            <w:proofErr w:type="spellStart"/>
+            <w:proofErr w:type="spellEnd"/>
+            <w:proofErr w:type="spellStart"/>
+            <w:proofErr w:type="spellEnd"/>
+            <w:proofErr w:type="spellStart"/>
+            <w:proofErr w:type="spellEnd"/>
+            <w:proofErr w:type="spellStart"/>
+            <w:proofErr w:type="spellEnd"/>
+            <w:proofErr w:type="spellStart"/>
+            <w:proofErr w:type="spellEnd"/>
+            <w:proofErr w:type="spellStart"/>
+            <w:proofErr w:type="spellEnd"/>
+            <w:proofErr w:type="spellStart"/>
+            <w:proofErr w:type="spellEnd"/>
+            <w:proofErr w:type="spellStart"/>
+            <w:proofErr w:type="spellEnd"/>
+            <w:proofErr w:type="spellStart"/>
+            <w:proofErr w:type="spellEnd"/>
+            <w:proofErr w:type="spellStart"/>
+            <w:proofErr w:type="spellEnd"/>
+            <w:proofErr w:type="spellStart"/>
+            <w:proofErr w:type="spellEnd"/>
+            <w:proofErr w:type="spellStart"/>
+            <w:proofErr w:type="spellEnd"/>
+            <w:proofErr w:type="spellStart"/>
+            <w:proofErr w:type="spellEnd"/>
+            <w:proofErr w:type="spellStart"/>
+            <w:proofErr w:type="spellEnd"/>
+            <w:proofErr w:type="spellStart"/>
+            <w:proofErr w:type="spellEnd"/>
+            <w:proofErr w:type="spellStart"/>
+            <w:proofErr w:type="spellEnd"/>
+            <w:proofErr w:type="spellStart"/>
+            <w:proofErr w:type="spellEnd"/>
+            <w:proofErr w:type="spellStart"/>
+            <w:proofErr w:type="spellEnd"/>
+            <w:proofErr w:type="spellStart"/>
+            <w:proofErr w:type="spellEnd"/>
+            <w:proofErr w:type="spellStart"/>
+            <w:proofErr w:type="spellEnd"/>
+            <w:proofErr w:type="spellStart"/>
+            <w:proofErr w:type="spellEnd"/>
+            <w:proofErr w:type="spellStart"/>
+            <w:proofErr w:type="spellEnd"/>
+            <w:proofErr w:type="spellStart"/>
+            <w:proofErr w:type="spellEnd"/>
+            <w:proofErr w:type="spellStart"/>
+            <w:proofErr w:type="spellEnd"/>
+            <w:proofErr w:type="spellStart"/>
+            <w:proofErr w:type="spellEnd"/>
+            <w:proofErr w:type="spellStart"/>
+            <w:proofErr w:type="spellEnd"/>
+            <w:proofErr w:type="spellStart"/>
+            <w:proofErr w:type="spellEnd"/>
+            <w:proofErr w:type="spellStart"/>
+            <w:proofErr w:type="spellEnd"/>
+            <w:proofErr w:type="spellStart"/>
+            <w:proofErr w:type="spellEnd"/>
+            <w:proofErr w:type="spellStart"/>
+            <w:proofErr w:type="spellEnd"/>
+          </w:p>
+        </w:tc>
+        <w:tc>
+          <w:tcPr>
+            <w:tcW w:w="1400" w:type="dxa"/>
+            <w:tcMar>
+              <w:top w:w="60" w:type="dxa"/>
+              <w:left w:w="100" w:type="dxa"/>
+              <w:bottom w:w="60" w:type="dxa"/>
+              <w:right w:w="100" w:type="dxa"/>
+            </w:tcMar>
+            <w:vAlign w:val="center"/>
+          </w:tcPr>
+          <w:p>
+            <w:proofErr w:type="spellStart"/>
+            <w:r>
+              <w:rPr>
+                <w:sz w:val="18"/>
+                <w:szCs w:val="18"/>
+              </w:rPr>
+              <w:t>Ràng buộc</w:t>
+            </w:r>
+            <w:proofErr w:type="spellEnd"/>
+            <w:proofErr w:type="spellStart"/>
+            <w:proofErr w:type="spellEnd"/>
+          </w:p>
+        </w:tc>
+        <w:tc>
+          <w:tcPr>
+            <w:tcW w:w="1300" w:type="dxa"/>
+            <w:tcMar>
+              <w:top w:w="60" w:type="dxa"/>
+              <w:left w:w="100" w:type="dxa"/>
+              <w:bottom w:w="60" w:type="dxa"/>
+              <w:right w:w="100" w:type="dxa"/>
+            </w:tcMar>
+            <w:vAlign w:val="center"/>
+          </w:tcPr>
+          <w:p>
+            <w:r>
+              <w:rPr>
+                <w:sz w:val="18"/>
+                <w:szCs w:val="18"/>
+              </w:rPr>
+              <w:t>Động</w:t>
+            </w:r>
+          </w:p>
+        </w:tc>
+        <w:tc>
+          <w:tcPr>
+            <w:tcW w:w="2400" w:type="dxa"/>
+            <w:tcMar>
+              <w:top w:w="60" w:type="dxa"/>
+              <w:left w:w="100" w:type="dxa"/>
+              <w:bottom w:w="60" w:type="dxa"/>
+              <w:right w:w="100" w:type="dxa"/>
+            </w:tcMar>
+            <w:vAlign w:val="center"/>
+          </w:tcPr>
+          <w:p>
+            <w:r>
+              <w:rPr>
+                <w:sz w:val="18"/>
+                <w:szCs w:val="18"/>
+              </w:rPr>
+              <w:t>Quyết định người dùng 23/09/2026 (qua Claude) — bổ sung xác thực email khi Đăng ký; xem docs/00-Source-of-Truth.md §5.8</w:t>
+            </w:r>
+            <w:proofErr w:type="spellStart"/>
+            <w:proofErr w:type="spellEnd"/>
+            <w:proofErr w:type="spellStart"/>
+            <w:proofErr w:type="spellEnd"/>
+            <w:proofErr w:type="spellStart"/>
+            <w:proofErr w:type="spellEnd"/>
+            <w:proofErr w:type="spellStart"/>
+            <w:proofErr w:type="spellEnd"/>
+            <w:proofErr w:type="spellStart"/>
+            <w:proofErr w:type="spellEnd"/>
+            <w:proofErr w:type="spellStart"/>
+            <w:proofErr w:type="spellEnd"/>
+            <w:proofErr w:type="spellStart"/>
+            <w:proofErr w:type="spellEnd"/>
+            <w:proofErr w:type="spellStart"/>
+            <w:proofErr w:type="spellEnd"/>
+            <w:proofErr w:type="spellStart"/>
+            <w:proofErr w:type="spellEnd"/>
+            <w:proofErr w:type="spellStart"/>
+            <w:proofErr w:type="spellEnd"/>
+            <w:proofErr w:type="spellStart"/>
+            <w:proofErr w:type="spellEnd"/>
+            <w:proofErr w:type="spellStart"/>
+            <w:proofErr w:type="spellEnd"/>
+            <w:proofErr w:type="spellStart"/>
+            <w:proofErr w:type="spellEnd"/>
+            <w:proofErr w:type="spellStart"/>
+            <w:proofErr w:type="spellEnd"/>
+            <w:proofErr w:type="spellStart"/>
+            <w:proofErr w:type="spellEnd"/>
+            <w:proofErr w:type="spellStart"/>
+            <w:proofErr w:type="spellEnd"/>
+            <w:proofErr w:type="spellStart"/>
+            <w:proofErr w:type="spellEnd"/>
+            <w:proofErr w:type="spellStart"/>
+            <w:proofErr w:type="spellEnd"/>
+            <w:proofErr w:type="spellStart"/>
+            <w:proofErr w:type="spellEnd"/>
+            <w:proofErr w:type="spellStart"/>
+            <w:proofErr w:type="spellEnd"/>
+            <w:proofErr w:type="spellStart"/>
+            <w:proofErr w:type="spellEnd"/>
+            <w:proofErr w:type="spellStart"/>
+            <w:proofErr w:type="spellEnd"/>
+            <w:proofErr w:type="spellStart"/>
+            <w:proofErr w:type="spellEnd"/>
+            <w:proofErr w:type="spellStart"/>
+            <w:proofErr w:type="spellEnd"/>
+            <w:proofErr w:type="spellStart"/>
+            <w:proofErr w:type="spellEnd"/>
+            <w:proofErr w:type="spellStart"/>
+            <w:proofErr w:type="spellEnd"/>
+            <w:proofErr w:type="spellStart"/>
+            <w:proofErr w:type="spellEnd"/>
+            <w:proofErr w:type="spellStart"/>
+            <w:proofErr w:type="spellEnd"/>
+            <w:proofErr w:type="spellStart"/>
+            <w:proofErr w:type="spellEnd"/>
+            <w:proofErr w:type="spellStart"/>
+            <w:proofErr w:type="spellEnd"/>
+            <w:proofErr w:type="spellStart"/>
+            <w:proofErr w:type="spellEnd"/>
+            <w:proofErr w:type="spellStart"/>
+            <w:proofErr w:type="spellEnd"/>
+            <w:proofErr w:type="spellStart"/>
+            <w:proofErr w:type="spellEnd"/>
           </w:p>
         </w:tc>
       </w:tr>

</xml_diff>